<commit_message>
feat(server): build CV downloads from the real resume
- PDF is now the HTML resume printed with headless Chrome (puppeteer-core),
  so the download matches the online version exactly
- DOCX regenerated from resume-data.js with the real content and a matching
  monochrome layout
- Drop pdfkit; puppeteer-core reuses an installed Chrome/Edge (CHROME_PATH)
</commit_message>
<xml_diff>
--- a/server/files/Shourya_Bansal_CV.docx
+++ b/server/files/Shourya_Bansal_CV.docx
@@ -3,58 +3,133 @@
 <w:document xmlns:wpc="http://schemas.microsoft.com/office/word/2010/wordprocessingCanvas" xmlns:mc="http://schemas.openxmlformats.org/markup-compatibility/2006" xmlns:o="urn:schemas-microsoft-com:office:office" xmlns:r="http://schemas.openxmlformats.org/officeDocument/2006/relationships" xmlns:m="http://schemas.openxmlformats.org/officeDocument/2006/math" xmlns:v="urn:schemas-microsoft-com:vml" xmlns:wp14="http://schemas.microsoft.com/office/word/2010/wordprocessingDrawing" xmlns:wp="http://schemas.openxmlformats.org/drawingml/2006/wordprocessingDrawing" xmlns:w10="urn:schemas-microsoft-com:office:word" xmlns:w="http://schemas.openxmlformats.org/wordprocessingml/2006/main" xmlns:w14="http://schemas.microsoft.com/office/word/2010/wordml" xmlns:w15="http://schemas.microsoft.com/office/word/2012/wordml" xmlns:wpg="http://schemas.microsoft.com/office/word/2010/wordprocessingGroup" xmlns:wpi="http://schemas.microsoft.com/office/word/2010/wordprocessingInk" xmlns:wne="http://schemas.microsoft.com/office/word/2006/wordml" xmlns:wps="http://schemas.microsoft.com/office/word/2010/wordprocessingShape" xmlns:cx="http://schemas.microsoft.com/office/drawing/2014/chartex" xmlns:cx1="http://schemas.microsoft.com/office/drawing/2015/9/8/chartex" xmlns:cx2="http://schemas.microsoft.com/office/drawing/2015/10/21/chartex" xmlns:cx3="http://schemas.microsoft.com/office/drawing/2016/5/9/chartex" xmlns:cx4="http://schemas.microsoft.com/office/drawing/2016/5/10/chartex" xmlns:cx5="http://schemas.microsoft.com/office/drawing/2016/5/11/chartex" xmlns:cx6="http://schemas.microsoft.com/office/drawing/2016/5/12/chartex" xmlns:cx7="http://schemas.microsoft.com/office/drawing/2016/5/13/chartex" xmlns:cx8="http://schemas.microsoft.com/office/drawing/2016/5/14/chartex" xmlns:aink="http://schemas.microsoft.com/office/drawing/2016/ink" xmlns:am3d="http://schemas.microsoft.com/office/drawing/2017/model3d" xmlns:w16cex="http://schemas.microsoft.com/office/word/2018/wordml/cex" xmlns:w16cid="http://schemas.microsoft.com/office/word/2016/wordml/cid" xmlns:w16="http://schemas.microsoft.com/office/word/2018/wordml" xmlns:w16sdtdh="http://schemas.microsoft.com/office/word/2020/wordml/sdtdatahash" xmlns:w16se="http://schemas.microsoft.com/office/word/2015/wordml/symex" mc:Ignorable="w14 w15 wp14">
   <w:body>
     <w:p>
-      <w:pPr>
-        <w:jc w:val="center"/>
-      </w:pPr>
-      <w:r>
-        <w:rPr>
-          <w:b/>
-          <w:bCs/>
-          <w:sz w:val="48"/>
-          <w:szCs w:val="48"/>
+      <w:r>
+        <w:rPr>
+          <w:rFonts w:ascii="Cormorant Garamond" w:cs="Cormorant Garamond" w:eastAsia="Cormorant Garamond" w:hAnsi="Cormorant Garamond"/>
+          <w:b/>
+          <w:bCs/>
+          <w:sz w:val="64"/>
+          <w:szCs w:val="64"/>
         </w:rPr>
         <w:t xml:space="preserve">Shourya Bansal</w:t>
       </w:r>
     </w:p>
     <w:p>
       <w:pPr>
-        <w:jc w:val="center"/>
-      </w:pPr>
-      <w:r>
-        <w:rPr>
-          <w:color w:val="6d28d9"/>
-          <w:sz w:val="26"/>
-          <w:szCs w:val="26"/>
-        </w:rPr>
-        <w:t xml:space="preserve">MERN Stack Developer</w:t>
-      </w:r>
-    </w:p>
-    <w:p>
-      <w:pPr>
-        <w:jc w:val="center"/>
+        <w:spacing w:after="80"/>
       </w:pPr>
       <w:r>
         <w:rPr>
           <w:color w:val="555555"/>
-          <w:sz w:val="18"/>
-          <w:szCs w:val="18"/>
-        </w:rPr>
-        <w:t xml:space="preserve">shouryabansal45@gmail.com  ·  India  ·  github.com/your-username  ·  linkedin.com/in/your-profile  ·  your-portfolio.vercel.app</w:t>
-      </w:r>
-    </w:p>
-    <w:p>
-      <w:pPr>
-        <w:pStyle w:val="Heading2"/>
+          <w:spacing w:val="80"/>
+          <w:sz w:val="21"/>
+          <w:szCs w:val="21"/>
+        </w:rPr>
+        <w:t xml:space="preserve">WEB DEVELOPER</w:t>
+      </w:r>
+    </w:p>
+    <w:p>
+      <w:pPr>
         <w:pBdr>
-          <w:bottom w:val="single" w:color="6d28d9" w:sz="6" w:space="2"/>
+          <w:bottom w:val="single" w:color="000000" w:sz="6" w:space="6"/>
         </w:pBdr>
-        <w:spacing w:after="100" w:before="240"/>
-      </w:pPr>
-      <w:r>
-        <w:rPr>
-          <w:b/>
-          <w:bCs/>
-          <w:color w:val="6d28d9"/>
+      </w:pPr>
+      <w:hyperlink w:history="1" r:id="rId6sx2dct-1uvm2t7xqfc2u">
+        <w:r>
+          <w:rPr>
+            <w:color w:val="333333"/>
+            <w:sz w:val="19"/>
+            <w:szCs w:val="19"/>
+          </w:rPr>
+          <w:t xml:space="preserve">+91 9376666070</w:t>
+        </w:r>
+      </w:hyperlink>
+      <w:r>
+        <w:rPr>
+          <w:color w:val="BBBBBB"/>
+          <w:sz w:val="14"/>
+          <w:szCs w:val="14"/>
+        </w:rPr>
+        <w:t xml:space="preserve">  ◆  </w:t>
+      </w:r>
+      <w:hyperlink w:history="1" r:id="rIdnlj8atsd8xiqo4qjuxq6o">
+        <w:r>
+          <w:rPr>
+            <w:color w:val="333333"/>
+            <w:sz w:val="19"/>
+            <w:szCs w:val="19"/>
+          </w:rPr>
+          <w:t xml:space="preserve">shouryabansal02@gmail.com</w:t>
+        </w:r>
+      </w:hyperlink>
+      <w:r>
+        <w:rPr>
+          <w:color w:val="BBBBBB"/>
+          <w:sz w:val="14"/>
+          <w:szCs w:val="14"/>
+        </w:rPr>
+        <w:t xml:space="preserve">  ◆  </w:t>
+      </w:r>
+      <w:hyperlink w:history="1" r:id="rIdua5spsrmpslqqjreu2zv0">
+        <w:r>
+          <w:rPr>
+            <w:color w:val="333333"/>
+            <w:sz w:val="19"/>
+            <w:szCs w:val="19"/>
+          </w:rPr>
+          <w:t xml:space="preserve">GitHub</w:t>
+        </w:r>
+      </w:hyperlink>
+      <w:r>
+        <w:rPr>
+          <w:color w:val="BBBBBB"/>
+          <w:sz w:val="14"/>
+          <w:szCs w:val="14"/>
+        </w:rPr>
+        <w:t xml:space="preserve">  ◆  </w:t>
+      </w:r>
+      <w:hyperlink w:history="1" r:id="rIdsnebqm9hdflgo8mdqbfjp">
+        <w:r>
+          <w:rPr>
+            <w:color w:val="333333"/>
+            <w:sz w:val="19"/>
+            <w:szCs w:val="19"/>
+          </w:rPr>
+          <w:t xml:space="preserve">LinkedIn</w:t>
+        </w:r>
+      </w:hyperlink>
+      <w:r>
+        <w:rPr>
+          <w:color w:val="BBBBBB"/>
+          <w:sz w:val="14"/>
+          <w:szCs w:val="14"/>
+        </w:rPr>
+        <w:t xml:space="preserve">  ◆  </w:t>
+      </w:r>
+      <w:hyperlink w:history="1" r:id="rIdcljsinko3hqekhxmpx-ly">
+        <w:r>
+          <w:rPr>
+            <w:color w:val="333333"/>
+            <w:sz w:val="19"/>
+            <w:szCs w:val="19"/>
+          </w:rPr>
+          <w:t xml:space="preserve">Certificates</w:t>
+        </w:r>
+      </w:hyperlink>
+    </w:p>
+    <w:p>
+      <w:pPr>
+        <w:pBdr>
+          <w:bottom w:val="single" w:color="DDDDDD" w:sz="6" w:space="2"/>
+        </w:pBdr>
+        <w:spacing w:after="100" w:before="260"/>
+      </w:pPr>
+      <w:r>
+        <w:rPr>
+          <w:rFonts w:ascii="Cormorant Garamond" w:cs="Cormorant Garamond" w:eastAsia="Cormorant Garamond" w:hAnsi="Cormorant Garamond"/>
+          <w:b/>
+          <w:bCs/>
+          <w:spacing w:val="60"/>
           <w:sz w:val="24"/>
           <w:szCs w:val="24"/>
         </w:rPr>
@@ -63,116 +138,692 @@
     </w:p>
     <w:p>
       <w:pPr>
-        <w:spacing w:after="80"/>
-      </w:pPr>
-      <w:r>
-        <w:t xml:space="preserve">Full-stack developer focused on the MERN stack (MongoDB, Express.js, React, Node.js). I enjoy building responsive, accessible interfaces backed by clean REST APIs, and I care about shipping projects end-to-end — from database schema to deployment.</w:t>
-      </w:r>
-    </w:p>
-    <w:p>
-      <w:pPr>
-        <w:pStyle w:val="Heading2"/>
         <w:pBdr>
-          <w:bottom w:val="single" w:color="6d28d9" w:sz="6" w:space="2"/>
+          <w:left w:val="single" w:color="000000" w:sz="18" w:space="8"/>
         </w:pBdr>
-        <w:spacing w:after="100" w:before="240"/>
-      </w:pPr>
-      <w:r>
-        <w:rPr>
-          <w:b/>
-          <w:bCs/>
-          <w:color w:val="6d28d9"/>
+        <w:jc w:val="both"/>
+      </w:pPr>
+      <w:r>
+        <w:rPr>
+          <w:color w:val="2A2A2A"/>
+        </w:rPr>
+        <w:t xml:space="preserve">CSE undergraduate passionate about building scalable, impactful tech products that solve real-world problems. Experienced in transforming ideas into prototypes, refining them through feedback, and deploying production-ready solutions. Dedicated to continuous learning and leveraging emerging technologies to drive meaningful digital transformation.</w:t>
+      </w:r>
+    </w:p>
+    <w:p>
+      <w:pPr>
+        <w:pBdr>
+          <w:bottom w:val="single" w:color="DDDDDD" w:sz="6" w:space="2"/>
+        </w:pBdr>
+        <w:spacing w:after="100" w:before="260"/>
+      </w:pPr>
+      <w:r>
+        <w:rPr>
+          <w:rFonts w:ascii="Cormorant Garamond" w:cs="Cormorant Garamond" w:eastAsia="Cormorant Garamond" w:hAnsi="Cormorant Garamond"/>
+          <w:b/>
+          <w:bCs/>
+          <w:spacing w:val="60"/>
           <w:sz w:val="24"/>
           <w:szCs w:val="24"/>
         </w:rPr>
-        <w:t xml:space="preserve">TECHNICAL SKILLS</w:t>
-      </w:r>
-    </w:p>
-    <w:p>
-      <w:r>
-        <w:rPr>
-          <w:b/>
-          <w:bCs/>
-        </w:rPr>
-        <w:t xml:space="preserve">Frontend: </w:t>
-      </w:r>
-      <w:r>
-        <w:t xml:space="preserve">React, React Router, JavaScript (ES6+), HTML5, CSS3, Tailwind CSS, Framer Motion</w:t>
-      </w:r>
-    </w:p>
-    <w:p>
-      <w:r>
-        <w:rPr>
-          <w:b/>
-          <w:bCs/>
-        </w:rPr>
-        <w:t xml:space="preserve">Backend: </w:t>
-      </w:r>
-      <w:r>
-        <w:t xml:space="preserve">Node.js, Express.js, REST APIs, JWT Authentication, Mongoose</w:t>
-      </w:r>
-    </w:p>
-    <w:p>
-      <w:r>
-        <w:rPr>
-          <w:b/>
-          <w:bCs/>
-        </w:rPr>
-        <w:t xml:space="preserve">Database: </w:t>
-      </w:r>
-      <w:r>
-        <w:t xml:space="preserve">MongoDB, MongoDB Atlas, MySQL</w:t>
-      </w:r>
-    </w:p>
-    <w:p>
-      <w:r>
-        <w:rPr>
-          <w:b/>
-          <w:bCs/>
-        </w:rPr>
-        <w:t xml:space="preserve">Tools: </w:t>
-      </w:r>
-      <w:r>
-        <w:t xml:space="preserve">Git &amp; GitHub, VS Code, Postman, Vercel, Render, npm, Figma</w:t>
-      </w:r>
-    </w:p>
-    <w:p>
-      <w:pPr>
-        <w:pStyle w:val="Heading2"/>
+        <w:t xml:space="preserve">EXPERIENCE</w:t>
+      </w:r>
+    </w:p>
+    <w:p>
+      <w:pPr>
+        <w:tabs>
+          <w:tab w:val="right" w:pos="9638"/>
+        </w:tabs>
+        <w:spacing w:before="100"/>
+      </w:pPr>
+      <w:r>
+        <w:rPr>
+          <w:b/>
+          <w:bCs/>
+        </w:rPr>
+        <w:t xml:space="preserve">Tech Lead</w:t>
+      </w:r>
+      <w:r>
+        <w:rPr>
+          <w:i/>
+          <w:iCs/>
+          <w:color w:val="888888"/>
+        </w:rPr>
+        <w:t xml:space="preserve"> @ Vibe</w:t>
+      </w:r>
+      <w:r>
+        <w:rPr>
+          <w:color w:val="777777"/>
+          <w:sz w:val="18"/>
+          <w:szCs w:val="18"/>
+        </w:rPr>
+        <w:t xml:space="preserve">	Aug 2025 – Present</w:t>
+      </w:r>
+    </w:p>
+    <w:p>
+      <w:pPr>
+        <w:spacing w:after="40"/>
+      </w:pPr>
+      <w:r>
+        <w:rPr>
+          <w:color w:val="444444"/>
+        </w:rPr>
+        <w:t xml:space="preserve">Leading technical development of a hyperlocal social discovery platform. Architecting privacy-first connections based on skills and interests using modern web stacks.</w:t>
+      </w:r>
+    </w:p>
+    <w:p>
+      <w:pPr>
+        <w:tabs>
+          <w:tab w:val="right" w:pos="9638"/>
+        </w:tabs>
+        <w:spacing w:before="100"/>
+      </w:pPr>
+      <w:r>
+        <w:rPr>
+          <w:b/>
+          <w:bCs/>
+        </w:rPr>
+        <w:t xml:space="preserve">Tech Lead</w:t>
+      </w:r>
+      <w:r>
+        <w:rPr>
+          <w:i/>
+          <w:iCs/>
+          <w:color w:val="888888"/>
+        </w:rPr>
+        <w:t xml:space="preserve"> @ Div</w:t>
+      </w:r>
+      <w:r>
+        <w:rPr>
+          <w:color w:val="777777"/>
+          <w:sz w:val="18"/>
+          <w:szCs w:val="18"/>
+        </w:rPr>
+        <w:t xml:space="preserve">	Oct 2025 – Present</w:t>
+      </w:r>
+    </w:p>
+    <w:p>
+      <w:pPr>
+        <w:spacing w:after="40"/>
+      </w:pPr>
+      <w:r>
+        <w:rPr>
+          <w:color w:val="444444"/>
+        </w:rPr>
+        <w:t xml:space="preserve">Developing a decentralized IP engine converting creative works into liquid tokens with automated, compliant royalty distribution mechanisms.</w:t>
+      </w:r>
+    </w:p>
+    <w:p>
+      <w:pPr>
+        <w:tabs>
+          <w:tab w:val="right" w:pos="9638"/>
+        </w:tabs>
+        <w:spacing w:before="100"/>
+      </w:pPr>
+      <w:r>
+        <w:rPr>
+          <w:b/>
+          <w:bCs/>
+        </w:rPr>
+        <w:t xml:space="preserve">Game &amp; Web Developer</w:t>
+      </w:r>
+      <w:r>
+        <w:rPr>
+          <w:i/>
+          <w:iCs/>
+          <w:color w:val="888888"/>
+        </w:rPr>
+        <w:t xml:space="preserve"> @ Punogames</w:t>
+      </w:r>
+      <w:r>
+        <w:rPr>
+          <w:color w:val="777777"/>
+          <w:sz w:val="18"/>
+          <w:szCs w:val="18"/>
+        </w:rPr>
+        <w:t xml:space="preserve">	June 2025 – Aug 2025</w:t>
+      </w:r>
+    </w:p>
+    <w:p>
+      <w:pPr>
+        <w:spacing w:after="40"/>
+      </w:pPr>
+      <w:r>
+        <w:rPr>
+          <w:color w:val="444444"/>
+        </w:rPr>
+        <w:t xml:space="preserve">Enhanced immersive gaming experiences by integrating complex game mechanics with seamless web interfaces.</w:t>
+      </w:r>
+    </w:p>
+    <w:p>
+      <w:pPr>
+        <w:tabs>
+          <w:tab w:val="right" w:pos="9638"/>
+        </w:tabs>
+        <w:spacing w:before="100"/>
+      </w:pPr>
+      <w:r>
+        <w:rPr>
+          <w:b/>
+          <w:bCs/>
+        </w:rPr>
+        <w:t xml:space="preserve">Software Developer</w:t>
+      </w:r>
+      <w:r>
+        <w:rPr>
+          <w:i/>
+          <w:iCs/>
+          <w:color w:val="888888"/>
+        </w:rPr>
+        <w:t xml:space="preserve"> @ Kare Kaise</w:t>
+      </w:r>
+      <w:r>
+        <w:rPr>
+          <w:color w:val="777777"/>
+          <w:sz w:val="18"/>
+          <w:szCs w:val="18"/>
+        </w:rPr>
+        <w:t xml:space="preserve">	Apr 2025 – June 2025</w:t>
+      </w:r>
+    </w:p>
+    <w:p>
+      <w:pPr>
+        <w:spacing w:after="40"/>
+      </w:pPr>
+      <w:r>
+        <w:rPr>
+          <w:color w:val="444444"/>
+        </w:rPr>
+        <w:t xml:space="preserve">Implemented scalable technical solutions and new feature sets to improve platform performance and user engagement.</w:t>
+      </w:r>
+    </w:p>
+    <w:p>
+      <w:pPr>
         <w:pBdr>
-          <w:bottom w:val="single" w:color="6d28d9" w:sz="6" w:space="2"/>
+          <w:bottom w:val="single" w:color="DDDDDD" w:sz="6" w:space="2"/>
         </w:pBdr>
-        <w:spacing w:after="100" w:before="240"/>
-      </w:pPr>
-      <w:r>
-        <w:rPr>
-          <w:b/>
-          <w:bCs/>
-          <w:color w:val="6d28d9"/>
+        <w:spacing w:after="100" w:before="260"/>
+      </w:pPr>
+      <w:r>
+        <w:rPr>
+          <w:rFonts w:ascii="Cormorant Garamond" w:cs="Cormorant Garamond" w:eastAsia="Cormorant Garamond" w:hAnsi="Cormorant Garamond"/>
+          <w:b/>
+          <w:bCs/>
+          <w:spacing w:val="60"/>
           <w:sz w:val="24"/>
           <w:szCs w:val="24"/>
         </w:rPr>
-        <w:t xml:space="preserve">EXPERIENCE</w:t>
+        <w:t xml:space="preserve">PROJECTS</w:t>
       </w:r>
     </w:p>
     <w:p>
       <w:pPr>
         <w:tabs>
-          <w:tab w:val="right" w:pos="9360"/>
+          <w:tab w:val="right" w:pos="9638"/>
         </w:tabs>
-      </w:pPr>
-      <w:r>
-        <w:rPr>
-          <w:b/>
-          <w:bCs/>
-        </w:rPr>
-        <w:t xml:space="preserve">Web Development Intern — Company Name</w:t>
-      </w:r>
-      <w:r>
-        <w:rPr>
+        <w:spacing w:before="100"/>
+      </w:pPr>
+      <w:r>
+        <w:rPr>
+          <w:b/>
+          <w:bCs/>
+        </w:rPr>
+        <w:t xml:space="preserve">Vibe</w:t>
+      </w:r>
+      <w:r>
+        <w:rPr>
+          <w:color w:val="777777"/>
+          <w:sz w:val="18"/>
+          <w:szCs w:val="18"/>
+        </w:rPr>
+        <w:t xml:space="preserve">	Aug 2025 – Present</w:t>
+      </w:r>
+    </w:p>
+    <w:p>
+      <w:pPr>
+        <w:spacing w:after="40"/>
+      </w:pPr>
+      <w:r>
+        <w:rPr>
+          <w:color w:val="444444"/>
+        </w:rPr>
+        <w:t xml:space="preserve">Rewires campus discovery with a verified, hyperlocal, privacy-first social layer that intelligently connects students by skills, interests, mood, and intent.</w:t>
+      </w:r>
+    </w:p>
+    <w:p>
+      <w:pPr>
+        <w:tabs>
+          <w:tab w:val="right" w:pos="9638"/>
+        </w:tabs>
+        <w:spacing w:before="100"/>
+      </w:pPr>
+      <w:r>
+        <w:rPr>
+          <w:b/>
+          <w:bCs/>
+        </w:rPr>
+        <w:t xml:space="preserve">Decentralized IP Tokens</w:t>
+      </w:r>
+      <w:r>
+        <w:rPr>
+          <w:color w:val="777777"/>
+          <w:sz w:val="18"/>
+          <w:szCs w:val="18"/>
+        </w:rPr>
+        <w:t xml:space="preserve">	Oct 2025 – Present</w:t>
+      </w:r>
+    </w:p>
+    <w:p>
+      <w:pPr>
+        <w:spacing w:after="40"/>
+      </w:pPr>
+      <w:r>
+        <w:rPr>
+          <w:color w:val="444444"/>
+        </w:rPr>
+        <w:t xml:space="preserve">A decentralized IP engine that turns creative works into liquid tokens with automated, compliant royalty distribution.</w:t>
+      </w:r>
+    </w:p>
+    <w:p>
+      <w:pPr>
+        <w:tabs>
+          <w:tab w:val="right" w:pos="9638"/>
+        </w:tabs>
+        <w:spacing w:before="100"/>
+      </w:pPr>
+      <w:r>
+        <w:rPr>
+          <w:b/>
+          <w:bCs/>
+        </w:rPr>
+        <w:t xml:space="preserve">अBhyaas</w:t>
+      </w:r>
+      <w:r>
+        <w:rPr>
+          <w:color w:val="777777"/>
+          <w:sz w:val="18"/>
+          <w:szCs w:val="18"/>
+        </w:rPr>
+        <w:t xml:space="preserve">	Nov 2024 – Present</w:t>
+      </w:r>
+    </w:p>
+    <w:p>
+      <w:pPr>
+        <w:spacing w:after="40"/>
+      </w:pPr>
+      <w:r>
+        <w:rPr>
+          <w:color w:val="444444"/>
+        </w:rPr>
+        <w:t xml:space="preserve">An innovative AI-centric EdTech solution that transforms knowledge into effective results for competitive practice.</w:t>
+      </w:r>
+    </w:p>
+    <w:p>
+      <w:pPr>
+        <w:tabs>
+          <w:tab w:val="right" w:pos="9638"/>
+        </w:tabs>
+        <w:spacing w:before="100"/>
+      </w:pPr>
+      <w:r>
+        <w:rPr>
+          <w:b/>
+          <w:bCs/>
+        </w:rPr>
+        <w:t xml:space="preserve">CloudGuard AI</w:t>
+      </w:r>
+      <w:r>
+        <w:rPr>
+          <w:color w:val="777777"/>
+          <w:sz w:val="18"/>
+          <w:szCs w:val="18"/>
+        </w:rPr>
+        <w:t xml:space="preserve">	Mar 2025 – Apr 2025</w:t>
+      </w:r>
+    </w:p>
+    <w:p>
+      <w:pPr>
+        <w:spacing w:after="40"/>
+      </w:pPr>
+      <w:r>
+        <w:rPr>
+          <w:color w:val="444444"/>
+        </w:rPr>
+        <w:t xml:space="preserve">Why Manage Cloud when they can manage themselves.</w:t>
+      </w:r>
+    </w:p>
+    <w:p>
+      <w:pPr>
+        <w:tabs>
+          <w:tab w:val="right" w:pos="9638"/>
+        </w:tabs>
+        <w:spacing w:before="100"/>
+      </w:pPr>
+      <w:r>
+        <w:rPr>
+          <w:b/>
+          <w:bCs/>
+        </w:rPr>
+        <w:t xml:space="preserve">FloatChat – AI Platform for Ocean Data</w:t>
+      </w:r>
+      <w:r>
+        <w:rPr>
+          <w:color w:val="777777"/>
+          <w:sz w:val="18"/>
+          <w:szCs w:val="18"/>
+        </w:rPr>
+        <w:t xml:space="preserve">	Jul 2025 – Aug 2025</w:t>
+      </w:r>
+    </w:p>
+    <w:p>
+      <w:pPr>
+        <w:spacing w:after="40"/>
+      </w:pPr>
+      <w:r>
+        <w:rPr>
+          <w:color w:val="444444"/>
+        </w:rPr>
+        <w:t xml:space="preserve">(Prototype) Conversational AI for ARGO datasets (temperature, salinity, currents).</w:t>
+      </w:r>
+    </w:p>
+    <w:p>
+      <w:pPr>
+        <w:tabs>
+          <w:tab w:val="right" w:pos="9638"/>
+        </w:tabs>
+        <w:spacing w:before="100"/>
+      </w:pPr>
+      <w:r>
+        <w:rPr>
+          <w:b/>
+          <w:bCs/>
+        </w:rPr>
+        <w:t xml:space="preserve">DevForge</w:t>
+      </w:r>
+      <w:r>
+        <w:rPr>
+          <w:color w:val="777777"/>
+          <w:sz w:val="18"/>
+          <w:szCs w:val="18"/>
+        </w:rPr>
+        <w:t xml:space="preserve">	Dec 2025</w:t>
+      </w:r>
+    </w:p>
+    <w:p>
+      <w:pPr>
+        <w:spacing w:after="40"/>
+      </w:pPr>
+      <w:r>
+        <w:rPr>
+          <w:color w:val="444444"/>
+        </w:rPr>
+        <w:t xml:space="preserve">AI-powered collaborative developer platform with real-time code execution, multi-language support, and integrated DevOps tooling.</w:t>
+      </w:r>
+    </w:p>
+    <w:p>
+      <w:pPr>
+        <w:tabs>
+          <w:tab w:val="right" w:pos="9638"/>
+        </w:tabs>
+        <w:spacing w:before="100"/>
+      </w:pPr>
+      <w:r>
+        <w:rPr>
+          <w:b/>
+          <w:bCs/>
+        </w:rPr>
+        <w:t xml:space="preserve">NexIDE</w:t>
+      </w:r>
+      <w:r>
+        <w:rPr>
+          <w:color w:val="777777"/>
+          <w:sz w:val="18"/>
+          <w:szCs w:val="18"/>
+        </w:rPr>
+        <w:t xml:space="preserve">	Feb 2026</w:t>
+      </w:r>
+    </w:p>
+    <w:p>
+      <w:pPr>
+        <w:spacing w:after="40"/>
+      </w:pPr>
+      <w:r>
+        <w:rPr>
+          <w:color w:val="444444"/>
+        </w:rPr>
+        <w:t xml:space="preserve">Browser-based IDE with multi-language execution, file management, and a modern developer experience built from scratch.</w:t>
+      </w:r>
+    </w:p>
+    <w:p>
+      <w:pPr>
+        <w:tabs>
+          <w:tab w:val="right" w:pos="9638"/>
+        </w:tabs>
+        <w:spacing w:before="100"/>
+      </w:pPr>
+      <w:r>
+        <w:rPr>
+          <w:b/>
+          <w:bCs/>
+        </w:rPr>
+        <w:t xml:space="preserve">Nexus URL</w:t>
+      </w:r>
+      <w:r>
+        <w:rPr>
+          <w:color w:val="777777"/>
+          <w:sz w:val="18"/>
+          <w:szCs w:val="18"/>
+        </w:rPr>
+        <w:t xml:space="preserve">	Apr 2026</w:t>
+      </w:r>
+    </w:p>
+    <w:p>
+      <w:pPr>
+        <w:spacing w:after="40"/>
+      </w:pPr>
+      <w:r>
+        <w:rPr>
+          <w:color w:val="444444"/>
+        </w:rPr>
+        <w:t xml:space="preserve">High-performance URL shortener with analytics dashboards, custom aliases, and optimized redirect latency via caching.</w:t>
+      </w:r>
+    </w:p>
+    <w:p>
+      <w:pPr>
+        <w:pBdr>
+          <w:bottom w:val="single" w:color="DDDDDD" w:sz="6" w:space="2"/>
+        </w:pBdr>
+        <w:spacing w:after="100" w:before="260"/>
+      </w:pPr>
+      <w:r>
+        <w:rPr>
+          <w:rFonts w:ascii="Cormorant Garamond" w:cs="Cormorant Garamond" w:eastAsia="Cormorant Garamond" w:hAnsi="Cormorant Garamond"/>
+          <w:b/>
+          <w:bCs/>
+          <w:spacing w:val="60"/>
+          <w:sz w:val="24"/>
+          <w:szCs w:val="24"/>
+        </w:rPr>
+        <w:t xml:space="preserve">EDUCATION</w:t>
+      </w:r>
+    </w:p>
+    <w:p>
+      <w:pPr>
+        <w:tabs>
+          <w:tab w:val="right" w:pos="9638"/>
+        </w:tabs>
+        <w:spacing w:before="100"/>
+      </w:pPr>
+      <w:r>
+        <w:rPr>
+          <w:b/>
+          <w:bCs/>
+        </w:rPr>
+        <w:t xml:space="preserve">B.Tech in CS Engineering</w:t>
+      </w:r>
+      <w:r>
+        <w:rPr>
+          <w:color w:val="777777"/>
+          <w:sz w:val="18"/>
+          <w:szCs w:val="18"/>
+        </w:rPr>
+        <w:t xml:space="preserve">	2024 – 2028</w:t>
+      </w:r>
+    </w:p>
+    <w:p>
+      <w:r>
+        <w:rPr>
+          <w:i/>
+          <w:iCs/>
           <w:color w:val="555555"/>
         </w:rPr>
-        <w:t xml:space="preserve">	Jun 2026 – Aug 2026</w:t>
+        <w:t xml:space="preserve">JK Lakshmipat University, Jaipur</w:t>
+      </w:r>
+    </w:p>
+    <w:p>
+      <w:pPr>
+        <w:pBdr>
+          <w:bottom w:val="single" w:color="DDDDDD" w:sz="6" w:space="2"/>
+        </w:pBdr>
+        <w:spacing w:after="100" w:before="260"/>
+      </w:pPr>
+      <w:r>
+        <w:rPr>
+          <w:rFonts w:ascii="Cormorant Garamond" w:cs="Cormorant Garamond" w:eastAsia="Cormorant Garamond" w:hAnsi="Cormorant Garamond"/>
+          <w:b/>
+          <w:bCs/>
+          <w:spacing w:val="60"/>
+          <w:sz w:val="24"/>
+          <w:szCs w:val="24"/>
+        </w:rPr>
+        <w:t xml:space="preserve">SKILLS</w:t>
+      </w:r>
+    </w:p>
+    <w:p>
+      <w:pPr>
+        <w:spacing w:after="40"/>
+      </w:pPr>
+      <w:r>
+        <w:rPr>
+          <w:b/>
+          <w:bCs/>
+        </w:rPr>
+        <w:t xml:space="preserve">Programming &amp; Scripting: </w:t>
+      </w:r>
+      <w:r>
+        <w:rPr>
+          <w:color w:val="555555"/>
+        </w:rPr>
+        <w:t xml:space="preserve">C, Python, JavaScript, Bash</w:t>
+      </w:r>
+    </w:p>
+    <w:p>
+      <w:pPr>
+        <w:spacing w:after="40"/>
+      </w:pPr>
+      <w:r>
+        <w:rPr>
+          <w:b/>
+          <w:bCs/>
+        </w:rPr>
+        <w:t xml:space="preserve">Web Development: </w:t>
+      </w:r>
+      <w:r>
+        <w:rPr>
+          <w:color w:val="555555"/>
+        </w:rPr>
+        <w:t xml:space="preserve">HTML, CSS, Markdown, JSON, React.js, Node.js, Express.js, Tailwind CSS, Bootstrap, FastAPI</w:t>
+      </w:r>
+    </w:p>
+    <w:p>
+      <w:pPr>
+        <w:spacing w:after="40"/>
+      </w:pPr>
+      <w:r>
+        <w:rPr>
+          <w:b/>
+          <w:bCs/>
+        </w:rPr>
+        <w:t xml:space="preserve">Databases: </w:t>
+      </w:r>
+      <w:r>
+        <w:rPr>
+          <w:color w:val="555555"/>
+        </w:rPr>
+        <w:t xml:space="preserve">MySQL, PostgreSQL, SQLite, MongoDB</w:t>
+      </w:r>
+    </w:p>
+    <w:p>
+      <w:pPr>
+        <w:spacing w:after="40"/>
+      </w:pPr>
+      <w:r>
+        <w:rPr>
+          <w:b/>
+          <w:bCs/>
+        </w:rPr>
+        <w:t xml:space="preserve">Data Science &amp; AI/ML: </w:t>
+      </w:r>
+      <w:r>
+        <w:rPr>
+          <w:color w:val="555555"/>
+        </w:rPr>
+        <w:t xml:space="preserve">PyTorch, Scikit-learn, NumPy, Pandas, Matplotlib, Plotly, Jupyter, Anaconda</w:t>
+      </w:r>
+    </w:p>
+    <w:p>
+      <w:pPr>
+        <w:spacing w:after="40"/>
+      </w:pPr>
+      <w:r>
+        <w:rPr>
+          <w:b/>
+          <w:bCs/>
+        </w:rPr>
+        <w:t xml:space="preserve">DevOps &amp; Tools: </w:t>
+      </w:r>
+      <w:r>
+        <w:rPr>
+          <w:color w:val="555555"/>
+        </w:rPr>
+        <w:t xml:space="preserve">Git, GitHub, Vercel, Netlify, Render, GitHub Actions, Postman</w:t>
+      </w:r>
+    </w:p>
+    <w:p>
+      <w:pPr>
+        <w:spacing w:after="40"/>
+      </w:pPr>
+      <w:r>
+        <w:rPr>
+          <w:b/>
+          <w:bCs/>
+        </w:rPr>
+        <w:t xml:space="preserve">Soft Skills: </w:t>
+      </w:r>
+      <w:r>
+        <w:rPr>
+          <w:color w:val="555555"/>
+        </w:rPr>
+        <w:t xml:space="preserve">Leadership, Teamwork, Problem-Solving, Public Speaking</w:t>
+      </w:r>
+    </w:p>
+    <w:p>
+      <w:pPr>
+        <w:pBdr>
+          <w:bottom w:val="single" w:color="DDDDDD" w:sz="6" w:space="2"/>
+        </w:pBdr>
+        <w:spacing w:after="100" w:before="260"/>
+      </w:pPr>
+      <w:r>
+        <w:rPr>
+          <w:rFonts w:ascii="Cormorant Garamond" w:cs="Cormorant Garamond" w:eastAsia="Cormorant Garamond" w:hAnsi="Cormorant Garamond"/>
+          <w:b/>
+          <w:bCs/>
+          <w:spacing w:val="60"/>
+          <w:sz w:val="24"/>
+          <w:szCs w:val="24"/>
+        </w:rPr>
+        <w:t xml:space="preserve">ACHIEVEMENTS</w:t>
       </w:r>
     </w:p>
     <w:p>
@@ -184,7 +835,18 @@
         </w:numPr>
       </w:pPr>
       <w:r>
-        <w:t xml:space="preserve">Built reusable React components and integrated them with Express REST endpoints.</w:t>
+        <w:rPr>
+          <w:color w:val="333333"/>
+        </w:rPr>
+        <w:t xml:space="preserve">State Level Open AI Hackathon</w:t>
+      </w:r>
+      <w:r>
+        <w:rPr>
+          <w:color w:val="999999"/>
+          <w:sz w:val="18"/>
+          <w:szCs w:val="18"/>
+        </w:rPr>
+        <w:t xml:space="preserve">  Jan 2026</w:t>
       </w:r>
     </w:p>
     <w:p>
@@ -196,7 +858,18 @@
         </w:numPr>
       </w:pPr>
       <w:r>
-        <w:t xml:space="preserve">Designed MongoDB schemas and wrote validation with Mongoose.</w:t>
+        <w:rPr>
+          <w:color w:val="333333"/>
+        </w:rPr>
+        <w:t xml:space="preserve">Business Pitch B-Plan, IIT Jodhpur</w:t>
+      </w:r>
+      <w:r>
+        <w:rPr>
+          <w:color w:val="999999"/>
+          <w:sz w:val="18"/>
+          <w:szCs w:val="18"/>
+        </w:rPr>
+        <w:t xml:space="preserve">  Jan 2026</w:t>
       </w:r>
     </w:p>
     <w:p>
@@ -208,195 +881,18 @@
         </w:numPr>
       </w:pPr>
       <w:r>
-        <w:t xml:space="preserve">Collaborated through Git pull requests and code reviews.</w:t>
-      </w:r>
-    </w:p>
-    <w:p>
-      <w:pPr>
-        <w:pStyle w:val="Heading2"/>
-        <w:pBdr>
-          <w:bottom w:val="single" w:color="6d28d9" w:sz="6" w:space="2"/>
-        </w:pBdr>
-        <w:spacing w:after="100" w:before="240"/>
-      </w:pPr>
-      <w:r>
-        <w:rPr>
-          <w:b/>
-          <w:bCs/>
-          <w:color w:val="6d28d9"/>
-          <w:sz w:val="24"/>
-          <w:szCs w:val="24"/>
-        </w:rPr>
-        <w:t xml:space="preserve">PROJECTS</w:t>
-      </w:r>
-    </w:p>
-    <w:p>
-      <w:r>
-        <w:rPr>
-          <w:b/>
-          <w:bCs/>
-        </w:rPr>
-        <w:t xml:space="preserve">Personal Portfolio (MERN)</w:t>
-      </w:r>
-      <w:r>
-        <w:rPr>
-          <w:i/>
-          <w:iCs/>
-          <w:color w:val="555555"/>
-        </w:rPr>
-        <w:t xml:space="preserve">   React, Express, MongoDB, Framer Motion</w:t>
-      </w:r>
-    </w:p>
-    <w:p>
-      <w:pPr>
-        <w:spacing w:after="80"/>
-      </w:pPr>
-      <w:r>
-        <w:t xml:space="preserve">Responsive portfolio with dark mode, animated sections, CV downloads served from Express and a contact form stored in MongoDB.</w:t>
-      </w:r>
-    </w:p>
-    <w:p>
-      <w:r>
-        <w:rPr>
-          <w:b/>
-          <w:bCs/>
-        </w:rPr>
-        <w:t xml:space="preserve">TaskFlow — Kanban Task Manager</w:t>
-      </w:r>
-      <w:r>
-        <w:rPr>
-          <w:i/>
-          <w:iCs/>
-          <w:color w:val="555555"/>
-        </w:rPr>
-        <w:t xml:space="preserve">   React, Node.js, Express, MongoDB, JWT</w:t>
-      </w:r>
-    </w:p>
-    <w:p>
-      <w:pPr>
-        <w:spacing w:after="80"/>
-      </w:pPr>
-      <w:r>
-        <w:t xml:space="preserve">Drag-and-drop task boards with user authentication, protected routes and real-time progress tracking.</w:t>
-      </w:r>
-    </w:p>
-    <w:p>
-      <w:r>
-        <w:rPr>
-          <w:b/>
-          <w:bCs/>
-        </w:rPr>
-        <w:t xml:space="preserve">ShopKart — E-commerce Store</w:t>
-      </w:r>
-      <w:r>
-        <w:rPr>
-          <w:i/>
-          <w:iCs/>
-          <w:color w:val="555555"/>
-        </w:rPr>
-        <w:t xml:space="preserve">   React, Redux Toolkit, Express, MongoDB, Stripe</w:t>
-      </w:r>
-    </w:p>
-    <w:p>
-      <w:pPr>
-        <w:spacing w:after="80"/>
-      </w:pPr>
-      <w:r>
-        <w:t xml:space="preserve">Product catalogue with search and filters, cart, checkout flow and an admin dashboard for orders.</w:t>
-      </w:r>
-    </w:p>
-    <w:p>
-      <w:pPr>
-        <w:pStyle w:val="Heading2"/>
-        <w:pBdr>
-          <w:bottom w:val="single" w:color="6d28d9" w:sz="6" w:space="2"/>
-        </w:pBdr>
-        <w:spacing w:after="100" w:before="240"/>
-      </w:pPr>
-      <w:r>
-        <w:rPr>
-          <w:b/>
-          <w:bCs/>
-          <w:color w:val="6d28d9"/>
-          <w:sz w:val="24"/>
-          <w:szCs w:val="24"/>
-        </w:rPr>
-        <w:t xml:space="preserve">EDUCATION</w:t>
-      </w:r>
-    </w:p>
-    <w:p>
-      <w:pPr>
-        <w:tabs>
-          <w:tab w:val="right" w:pos="9360"/>
-        </w:tabs>
-      </w:pPr>
-      <w:r>
-        <w:rPr>
-          <w:b/>
-          <w:bCs/>
-        </w:rPr>
-        <w:t xml:space="preserve">B.Tech in Computer Science &amp; Engineering</w:t>
-      </w:r>
-      <w:r>
-        <w:rPr>
-          <w:color w:val="555555"/>
-        </w:rPr>
-        <w:t xml:space="preserve">	2023 – 2027</w:t>
-      </w:r>
-    </w:p>
-    <w:p>
-      <w:pPr>
-        <w:spacing w:after="80"/>
-      </w:pPr>
-      <w:r>
-        <w:t xml:space="preserve">Your University Name  •  CGPA: 8.5 / 10</w:t>
-      </w:r>
-    </w:p>
-    <w:p>
-      <w:pPr>
-        <w:tabs>
-          <w:tab w:val="right" w:pos="9360"/>
-        </w:tabs>
-      </w:pPr>
-      <w:r>
-        <w:rPr>
-          <w:b/>
-          <w:bCs/>
-        </w:rPr>
-        <w:t xml:space="preserve">Senior Secondary (Class XII), PCM</w:t>
-      </w:r>
-      <w:r>
-        <w:rPr>
-          <w:color w:val="555555"/>
-        </w:rPr>
-        <w:t xml:space="preserve">	2021 – 2023</w:t>
-      </w:r>
-    </w:p>
-    <w:p>
-      <w:pPr>
-        <w:spacing w:after="80"/>
-      </w:pPr>
-      <w:r>
-        <w:t xml:space="preserve">Your School Name</w:t>
-      </w:r>
-    </w:p>
-    <w:p>
-      <w:pPr>
-        <w:pStyle w:val="Heading2"/>
-        <w:pBdr>
-          <w:bottom w:val="single" w:color="6d28d9" w:sz="6" w:space="2"/>
-        </w:pBdr>
-        <w:spacing w:after="100" w:before="240"/>
-      </w:pPr>
-      <w:r>
-        <w:rPr>
-          <w:b/>
-          <w:bCs/>
-          <w:color w:val="6d28d9"/>
-          <w:sz w:val="24"/>
-          <w:szCs w:val="24"/>
-        </w:rPr>
-        <w:t xml:space="preserve">CERTIFICATIONS</w:t>
+        <w:rPr>
+          <w:color w:val="333333"/>
+        </w:rPr>
+        <w:t xml:space="preserve">Business Darbar, IIT Jodhpur</w:t>
+      </w:r>
+      <w:r>
+        <w:rPr>
+          <w:color w:val="999999"/>
+          <w:sz w:val="18"/>
+          <w:szCs w:val="18"/>
+        </w:rPr>
+        <w:t xml:space="preserve">  Jan 2026</w:t>
       </w:r>
     </w:p>
     <w:p>
@@ -408,7 +904,18 @@
         </w:numPr>
       </w:pPr>
       <w:r>
-        <w:t xml:space="preserve">MERN Stack Development Course — 2026</w:t>
+        <w:rPr>
+          <w:color w:val="333333"/>
+        </w:rPr>
+        <w:t xml:space="preserve">DBMS Certification, Infosys</w:t>
+      </w:r>
+      <w:r>
+        <w:rPr>
+          <w:color w:val="999999"/>
+          <w:sz w:val="18"/>
+          <w:szCs w:val="18"/>
+        </w:rPr>
+        <w:t xml:space="preserve">  Dec 2025</w:t>
       </w:r>
     </w:p>
     <w:p>
@@ -420,7 +927,18 @@
         </w:numPr>
       </w:pPr>
       <w:r>
-        <w:t xml:space="preserve">Meta Front-End Developer — Coursera</w:t>
+        <w:rPr>
+          <w:color w:val="333333"/>
+        </w:rPr>
+        <w:t xml:space="preserve">Most Innovative Pitch, PitchFest 2K25 (ICFAI University)</w:t>
+      </w:r>
+      <w:r>
+        <w:rPr>
+          <w:color w:val="999999"/>
+          <w:sz w:val="18"/>
+          <w:szCs w:val="18"/>
+        </w:rPr>
+        <w:t xml:space="preserve">  Oct 2025</w:t>
       </w:r>
     </w:p>
     <w:p>
@@ -432,7 +950,18 @@
         </w:numPr>
       </w:pPr>
       <w:r>
-        <w:t xml:space="preserve">Programming in Java — NPTEL</w:t>
+        <w:rPr>
+          <w:color w:val="333333"/>
+        </w:rPr>
+        <w:t xml:space="preserve">4th Position, House of Hack (Hackingly)</w:t>
+      </w:r>
+      <w:r>
+        <w:rPr>
+          <w:color w:val="999999"/>
+          <w:sz w:val="18"/>
+          <w:szCs w:val="18"/>
+        </w:rPr>
+        <w:t xml:space="preserve">  Sep 2025</w:t>
       </w:r>
     </w:p>
     <w:p>
@@ -444,12 +973,38 @@
         </w:numPr>
       </w:pPr>
       <w:r>
-        <w:t xml:space="preserve">Node.js Essential Training — LinkedIn Learning</w:t>
+        <w:rPr>
+          <w:color w:val="333333"/>
+        </w:rPr>
+        <w:t xml:space="preserve">Certified Web Developer, WsCube Tech</w:t>
+      </w:r>
+      <w:r>
+        <w:rPr>
+          <w:color w:val="999999"/>
+          <w:sz w:val="18"/>
+          <w:szCs w:val="18"/>
+        </w:rPr>
+        <w:t xml:space="preserve">  Jan 2025</w:t>
+      </w:r>
+    </w:p>
+    <w:p>
+      <w:pPr>
+        <w:pStyle w:val="ListParagraph"/>
+        <w:numPr>
+          <w:ilvl w:val="0"/>
+          <w:numId w:val="1"/>
+        </w:numPr>
+      </w:pPr>
+      <w:r>
+        <w:rPr>
+          <w:color w:val="333333"/>
+        </w:rPr>
+        <w:t xml:space="preserve">Gold Medalist, West Zone Archery</w:t>
       </w:r>
     </w:p>
     <w:sectPr>
       <w:pgSz w:w="11906" w:h="16838" w:orient="portrait"/>
-      <w:pgMar w:top="1440" w:right="1440" w:bottom="1440" w:left="1440" w:header="708" w:footer="708" w:gutter="0"/>
+      <w:pgMar w:top="850" w:right="1134" w:bottom="850" w:left="1134" w:header="708" w:footer="708" w:gutter="0"/>
       <w:pgNumType/>
       <w:docGrid w:linePitch="360"/>
     </w:sectPr>
@@ -631,9 +1186,9 @@
   <w:docDefaults>
     <w:rPrDefault>
       <w:rPr>
-        <w:rFonts w:ascii="Calibri" w:cs="Calibri" w:eastAsia="Calibri" w:hAnsi="Calibri"/>
-        <w:sz w:val="21"/>
-        <w:szCs w:val="21"/>
+        <w:rFonts w:ascii="Inter" w:cs="Inter" w:eastAsia="Inter" w:hAnsi="Inter"/>
+        <w:sz w:val="20"/>
+        <w:szCs w:val="20"/>
       </w:rPr>
     </w:rPrDefault>
     <w:pPrDefault/>

</xml_diff>